<commit_message>
docs(release): revise 1.5.1 readiness report
</commit_message>
<xml_diff>
--- a/outputs/MagicMusicCRM_26_правок_реальное_приложение_1.5.1.docx
+++ b/outputs/MagicMusicCRM_26_правок_реальное_приложение_1.5.1.docx
@@ -44,40 +44,6 @@
     </w:p>
     <w:p>
       <w:pPr>
-        <w:spacing w:after="360"/>
-        <w:rPr>
-          <w:lang w:val="ru-RU"/>
-        </w:rPr>
-      </w:pPr>
-      <w:r>
-        <w:rPr>
-          <w:color w:val="5F6B78"/>
-          <w:sz w:val="28"/>
-          <w:lang w:val="ru-RU"/>
-        </w:rPr>
-        <w:t xml:space="preserve">26 требований </w:t>
-      </w:r>
-      <w:proofErr w:type="gramStart"/>
-      <w:r>
-        <w:rPr>
-          <w:color w:val="5F6B78"/>
-          <w:sz w:val="28"/>
-          <w:lang w:val="ru-RU"/>
-        </w:rPr>
-        <w:t>заказчика  простыми</w:t>
-      </w:r>
-      <w:proofErr w:type="gramEnd"/>
-      <w:r>
-        <w:rPr>
-          <w:color w:val="5F6B78"/>
-          <w:sz w:val="28"/>
-          <w:lang w:val="ru-RU"/>
-        </w:rPr>
-        <w:t xml:space="preserve"> словами и на реальном приложении</w:t>
-      </w:r>
-    </w:p>
-    <w:p>
-      <w:pPr>
         <w:spacing w:after="40"/>
       </w:pPr>
       <w:proofErr w:type="spellStart"/>
@@ -262,16 +228,7 @@
         <w:rPr>
           <w:lang w:val="ru-RU"/>
         </w:rPr>
-        <w:t xml:space="preserve">-сборки в единственной тёмной теме. </w:t>
-      </w:r>
-      <w:r>
-        <w:t>Debug</w:t>
-      </w:r>
-      <w:r>
-        <w:rPr>
-          <w:lang w:val="ru-RU"/>
-        </w:rPr>
-        <w:t xml:space="preserve">-версия, светлая тема и вымышленные аудитории не использовались. Данные заметки и абонемента проверены на одном и том же </w:t>
+        <w:t xml:space="preserve">-сборки в единственной тёмной теме. Данные заметки и абонемента проверены на одном и том же </w:t>
       </w:r>
       <w:r>
         <w:t>production</w:t>
@@ -334,20 +291,6 @@
         <w:rPr>
           <w:lang w:val="ru-RU"/>
         </w:rPr>
-        <w:t>Один кадр не дублируется в разных пунктах: повторные пункты ссылаются на номер уже показанного рисунка.</w:t>
-      </w:r>
-    </w:p>
-    <w:p>
-      <w:pPr>
-        <w:pStyle w:val="a0"/>
-        <w:rPr>
-          <w:lang w:val="ru-RU"/>
-        </w:rPr>
-      </w:pPr>
-      <w:r>
-        <w:rPr>
-          <w:lang w:val="ru-RU"/>
-        </w:rPr>
         <w:t xml:space="preserve">Серверные </w:t>
       </w:r>
       <w:proofErr w:type="gramStart"/>
@@ -381,36 +324,6 @@
         </w:rPr>
         <w:t xml:space="preserve"> автоматическими проверками. Скриншот сам по себе этого доказать не может.</w:t>
       </w:r>
-    </w:p>
-    <w:p>
-      <w:pPr>
-        <w:pStyle w:val="a0"/>
-        <w:rPr>
-          <w:lang w:val="ru-RU"/>
-        </w:rPr>
-      </w:pPr>
-      <w:r>
-        <w:rPr>
-          <w:lang w:val="ru-RU"/>
-        </w:rPr>
-        <w:t xml:space="preserve">Состояние </w:t>
-      </w:r>
-      <w:r>
-        <w:t>production</w:t>
-      </w:r>
-      <w:r>
-        <w:rPr>
-          <w:lang w:val="ru-RU"/>
-        </w:rPr>
-        <w:t xml:space="preserve"> показано честно: если конфликтов или постоянных расписаний сейчас нет, отчёт не подменяет их вымышленными записями.</w:t>
-      </w:r>
-    </w:p>
-    <w:p>
-      <w:pPr>
-        <w:rPr>
-          <w:lang w:val="ru-RU"/>
-        </w:rPr>
-      </w:pPr>
       <w:r>
         <w:rPr>
           <w:lang w:val="ru-RU"/>
@@ -530,9 +443,9 @@
           <w:noProof/>
         </w:rPr>
         <w:drawing>
-          <wp:inline distT="0" distB="0" distL="0" distR="0" wp14:anchorId="62339754" wp14:editId="70414E0D">
-            <wp:extent cx="5943600" cy="3343275"/>
-            <wp:effectExtent l="0" t="0" r="0" b="0"/>
+          <wp:inline distT="0" distB="0" distL="0" distR="0" wp14:anchorId="62339754" wp14:editId="5E9E6FC0">
+            <wp:extent cx="5943600" cy="3216166"/>
+            <wp:effectExtent l="0" t="0" r="0" b="3810"/>
             <wp:docPr id="1" name="Тёмный интерфейс MagicMusicCRM на Windows Release: две внутренние вкладки, маршрут Настройки — Пользователь и список пра" descr="Тёмный интерфейс MagicMusicCRM на Windows Release: две внутренние вкладки, маршрут Настройки — Пользователь и список прав управляющего."/>
             <wp:cNvGraphicFramePr>
               <a:graphicFrameLocks xmlns:a="http://schemas.openxmlformats.org/drawingml/2006/main" noChangeAspect="1"/>
@@ -544,20 +457,29 @@
                     <pic:cNvPr id="0" name="magic-release-manager-capabilities-pc2.png"/>
                     <pic:cNvPicPr/>
                   </pic:nvPicPr>
-                  <pic:blipFill>
+                  <pic:blipFill rotWithShape="1">
                     <a:blip r:embed="rId8"/>
+                    <a:srcRect b="3802"/>
                     <a:stretch>
                       <a:fillRect/>
                     </a:stretch>
                   </pic:blipFill>
-                  <pic:spPr>
+                  <pic:spPr bwMode="auto">
                     <a:xfrm>
                       <a:off x="0" y="0"/>
-                      <a:ext cx="5943600" cy="3343275"/>
+                      <a:ext cx="5943600" cy="3216166"/>
                     </a:xfrm>
                     <a:prstGeom prst="rect">
                       <a:avLst/>
                     </a:prstGeom>
+                    <a:ln>
+                      <a:noFill/>
+                    </a:ln>
+                    <a:extLst>
+                      <a:ext uri="{53640926-AAD7-44D8-BBD7-CCE9431645EC}">
+                        <a14:shadowObscured xmlns:a14="http://schemas.microsoft.com/office/drawing/2010/main"/>
+                      </a:ext>
+                    </a:extLst>
                   </pic:spPr>
                 </pic:pic>
               </a:graphicData>
@@ -737,8 +659,8 @@
           <w:noProof/>
         </w:rPr>
         <w:drawing>
-          <wp:inline distT="0" distB="0" distL="0" distR="0" wp14:anchorId="145C2F14" wp14:editId="2F86CA8A">
-            <wp:extent cx="5943600" cy="3343275"/>
+          <wp:inline distT="0" distB="0" distL="0" distR="0" wp14:anchorId="145C2F14" wp14:editId="3DFA3113">
+            <wp:extent cx="5943600" cy="3168869"/>
             <wp:effectExtent l="0" t="0" r="0" b="0"/>
             <wp:docPr id="2" name="Настройки CRM на Windows Release с отдельными разделами Поля и категории и Варианты для полей, а также черновиком и публ" descr="Настройки CRM на Windows Release с отдельными разделами Поля и категории и Варианты для полей, а также черновиком и публикацией."/>
             <wp:cNvGraphicFramePr>
@@ -751,20 +673,29 @@
                     <pic:cNvPr id="0" name="magic-release-settings-pc.png"/>
                     <pic:cNvPicPr/>
                   </pic:nvPicPr>
-                  <pic:blipFill>
+                  <pic:blipFill rotWithShape="1">
                     <a:blip r:embed="rId9"/>
+                    <a:srcRect b="5217"/>
                     <a:stretch>
                       <a:fillRect/>
                     </a:stretch>
                   </pic:blipFill>
-                  <pic:spPr>
+                  <pic:spPr bwMode="auto">
                     <a:xfrm>
                       <a:off x="0" y="0"/>
-                      <a:ext cx="5943600" cy="3343275"/>
+                      <a:ext cx="5943600" cy="3168869"/>
                     </a:xfrm>
                     <a:prstGeom prst="rect">
                       <a:avLst/>
                     </a:prstGeom>
+                    <a:ln>
+                      <a:noFill/>
+                    </a:ln>
+                    <a:extLst>
+                      <a:ext uri="{53640926-AAD7-44D8-BBD7-CCE9431645EC}">
+                        <a14:shadowObscured xmlns:a14="http://schemas.microsoft.com/office/drawing/2010/main"/>
+                      </a:ext>
+                    </a:extLst>
                   </pic:spPr>
                 </pic:pic>
               </a:graphicData>
@@ -832,9 +763,9 @@
         </w:rPr>
         <w:lastRenderedPageBreak/>
         <w:drawing>
-          <wp:inline distT="0" distB="0" distL="0" distR="0" wp14:anchorId="6114D36B" wp14:editId="76FF8E0E">
-            <wp:extent cx="5943600" cy="3343275"/>
-            <wp:effectExtent l="0" t="0" r="0" b="0"/>
+          <wp:inline distT="0" distB="0" distL="0" distR="0" wp14:anchorId="6114D36B" wp14:editId="66BD9CBD">
+            <wp:extent cx="5943600" cy="3176752"/>
+            <wp:effectExtent l="0" t="0" r="0" b="5080"/>
             <wp:docPr id="3" name="Выпадающий список рекламных источников с реальными значениями Звонок, Мессенджер, Офлайн, Партнёры, Реклама, Сайт и друг" descr="Выпадающий список рекламных источников с реальными значениями Звонок, Мессенджер, Офлайн, Партнёры, Реклама, Сайт и другими."/>
             <wp:cNvGraphicFramePr>
               <a:graphicFrameLocks xmlns:a="http://schemas.openxmlformats.org/drawingml/2006/main" noChangeAspect="1"/>
@@ -846,20 +777,29 @@
                     <pic:cNvPr id="0" name="magic-release-card-source-menu.png"/>
                     <pic:cNvPicPr/>
                   </pic:nvPicPr>
-                  <pic:blipFill>
+                  <pic:blipFill rotWithShape="1">
                     <a:blip r:embed="rId10"/>
+                    <a:srcRect b="4981"/>
                     <a:stretch>
                       <a:fillRect/>
                     </a:stretch>
                   </pic:blipFill>
-                  <pic:spPr>
+                  <pic:spPr bwMode="auto">
                     <a:xfrm>
                       <a:off x="0" y="0"/>
-                      <a:ext cx="5943600" cy="3343275"/>
+                      <a:ext cx="5943600" cy="3176752"/>
                     </a:xfrm>
                     <a:prstGeom prst="rect">
                       <a:avLst/>
                     </a:prstGeom>
+                    <a:ln>
+                      <a:noFill/>
+                    </a:ln>
+                    <a:extLst>
+                      <a:ext uri="{53640926-AAD7-44D8-BBD7-CCE9431645EC}">
+                        <a14:shadowObscured xmlns:a14="http://schemas.microsoft.com/office/drawing/2010/main"/>
+                      </a:ext>
+                    </a:extLst>
                   </pic:spPr>
                 </pic:pic>
               </a:graphicData>
@@ -1087,9 +1027,9 @@
         </w:rPr>
         <w:lastRenderedPageBreak/>
         <w:drawing>
-          <wp:inline distT="0" distB="0" distL="0" distR="0" wp14:anchorId="44F9954A" wp14:editId="35E1086F">
-            <wp:extent cx="5943600" cy="3343275"/>
-            <wp:effectExtent l="0" t="0" r="0" b="0"/>
+          <wp:inline distT="0" distB="0" distL="0" distR="0" wp14:anchorId="44F9954A" wp14:editId="42C528C5">
+            <wp:extent cx="5943600" cy="3176752"/>
+            <wp:effectExtent l="0" t="0" r="0" b="5080"/>
             <wp:docPr id="4" name="Карточка реального ученика на Windows Release: обзор, заметка о клиенте, контакты, верхние переходы и единая левая навиг" descr="Карточка реального ученика на Windows Release: обзор, заметка о клиенте, контакты, верхние переходы и единая левая навигация."/>
             <wp:cNvGraphicFramePr>
               <a:graphicFrameLocks xmlns:a="http://schemas.openxmlformats.org/drawingml/2006/main" noChangeAspect="1"/>
@@ -1101,20 +1041,29 @@
                     <pic:cNvPr id="0" name="magic-release-client-note-pc-final.png"/>
                     <pic:cNvPicPr/>
                   </pic:nvPicPr>
-                  <pic:blipFill>
+                  <pic:blipFill rotWithShape="1">
                     <a:blip r:embed="rId11"/>
+                    <a:srcRect b="4981"/>
                     <a:stretch>
                       <a:fillRect/>
                     </a:stretch>
                   </pic:blipFill>
-                  <pic:spPr>
+                  <pic:spPr bwMode="auto">
                     <a:xfrm>
                       <a:off x="0" y="0"/>
-                      <a:ext cx="5943600" cy="3343275"/>
+                      <a:ext cx="5943600" cy="3176752"/>
                     </a:xfrm>
                     <a:prstGeom prst="rect">
                       <a:avLst/>
                     </a:prstGeom>
+                    <a:ln>
+                      <a:noFill/>
+                    </a:ln>
+                    <a:extLst>
+                      <a:ext uri="{53640926-AAD7-44D8-BBD7-CCE9431645EC}">
+                        <a14:shadowObscured xmlns:a14="http://schemas.microsoft.com/office/drawing/2010/main"/>
+                      </a:ext>
+                    </a:extLst>
                   </pic:spPr>
                 </pic:pic>
               </a:graphicData>
@@ -1409,8 +1358,8 @@
           <w:noProof/>
         </w:rPr>
         <w:drawing>
-          <wp:inline distT="0" distB="0" distL="0" distR="0" wp14:anchorId="67EF4311" wp14:editId="60ECE3FA">
-            <wp:extent cx="5943600" cy="3343275"/>
+          <wp:inline distT="0" distB="0" distL="0" distR="0" wp14:anchorId="67EF4311" wp14:editId="14E429FE">
+            <wp:extent cx="5943600" cy="3184635"/>
             <wp:effectExtent l="0" t="0" r="0" b="0"/>
             <wp:docPr id="6" name="Подтверждение покупки абонемента на Windows Release с реальным клиентом, суммой 24000 рублей и расчётом баланса до и пос" descr="Подтверждение покупки абонемента на Windows Release с реальным клиентом, суммой 24000 рублей и расчётом баланса до и после."/>
             <wp:cNvGraphicFramePr>
@@ -1423,20 +1372,29 @@
                     <pic:cNvPr id="0" name="magic-release-sub-confirm-live.png"/>
                     <pic:cNvPicPr/>
                   </pic:nvPicPr>
-                  <pic:blipFill>
+                  <pic:blipFill rotWithShape="1">
                     <a:blip r:embed="rId13"/>
+                    <a:srcRect b="4745"/>
                     <a:stretch>
                       <a:fillRect/>
                     </a:stretch>
                   </pic:blipFill>
-                  <pic:spPr>
+                  <pic:spPr bwMode="auto">
                     <a:xfrm>
                       <a:off x="0" y="0"/>
-                      <a:ext cx="5943600" cy="3343275"/>
+                      <a:ext cx="5943600" cy="3184635"/>
                     </a:xfrm>
                     <a:prstGeom prst="rect">
                       <a:avLst/>
                     </a:prstGeom>
+                    <a:ln>
+                      <a:noFill/>
+                    </a:ln>
+                    <a:extLst>
+                      <a:ext uri="{53640926-AAD7-44D8-BBD7-CCE9431645EC}">
+                        <a14:shadowObscured xmlns:a14="http://schemas.microsoft.com/office/drawing/2010/main"/>
+                      </a:ext>
+                    </a:extLst>
                   </pic:spPr>
                 </pic:pic>
               </a:graphicData>
@@ -1817,8 +1775,8 @@
           <w:noProof/>
         </w:rPr>
         <w:drawing>
-          <wp:inline distT="0" distB="0" distL="0" distR="0" wp14:anchorId="5BC6F631" wp14:editId="7ADF92B5">
-            <wp:extent cx="5943600" cy="3343275"/>
+          <wp:inline distT="0" distB="0" distL="0" distR="0" wp14:anchorId="5BC6F631" wp14:editId="0249652A">
+            <wp:extent cx="5943600" cy="3200400"/>
             <wp:effectExtent l="0" t="0" r="0" b="0"/>
             <wp:docPr id="8" name="Карточка реального ученика на Windows Release с блоком занятий, восемью оплаченными и доступными занятиями, предпочтител" descr="Карточка реального ученика на Windows Release с блоком занятий, восемью оплаченными и доступными занятиями, предпочтительным расписанием и кнопкой Добавить расписание."/>
             <wp:cNvGraphicFramePr>
@@ -1831,20 +1789,29 @@
                     <pic:cNvPr id="0" name="magic-release-client-subscription-pc.png"/>
                     <pic:cNvPicPr/>
                   </pic:nvPicPr>
-                  <pic:blipFill>
+                  <pic:blipFill rotWithShape="1">
                     <a:blip r:embed="rId15"/>
+                    <a:srcRect b="4273"/>
                     <a:stretch>
                       <a:fillRect/>
                     </a:stretch>
                   </pic:blipFill>
-                  <pic:spPr>
+                  <pic:spPr bwMode="auto">
                     <a:xfrm>
                       <a:off x="0" y="0"/>
-                      <a:ext cx="5943600" cy="3343275"/>
+                      <a:ext cx="5943600" cy="3200400"/>
                     </a:xfrm>
                     <a:prstGeom prst="rect">
                       <a:avLst/>
                     </a:prstGeom>
+                    <a:ln>
+                      <a:noFill/>
+                    </a:ln>
+                    <a:extLst>
+                      <a:ext uri="{53640926-AAD7-44D8-BBD7-CCE9431645EC}">
+                        <a14:shadowObscured xmlns:a14="http://schemas.microsoft.com/office/drawing/2010/main"/>
+                      </a:ext>
+                    </a:extLst>
                   </pic:spPr>
                 </pic:pic>
               </a:graphicData>
@@ -2086,8 +2053,8 @@
           <w:noProof/>
         </w:rPr>
         <w:drawing>
-          <wp:inline distT="0" distB="0" distL="0" distR="0" wp14:anchorId="6E0C32F2" wp14:editId="650B5E3B">
-            <wp:extent cx="5943600" cy="3343275"/>
+          <wp:inline distT="0" distB="0" distL="0" distR="0" wp14:anchorId="6E0C32F2" wp14:editId="1A9DFDD5">
+            <wp:extent cx="5943600" cy="3184634"/>
             <wp:effectExtent l="0" t="0" r="0" b="0"/>
             <wp:docPr id="9" name="Форма создания занятия на Windows Release с обязательными клиентом, преподавателем, филиалом Сокол, аудиторией, датой, в" descr="Форма создания занятия на Windows Release с обязательными клиентом, преподавателем, филиалом Сокол, аудиторией, датой, временем, длительностью, типом списания и оплатой преподавателю."/>
             <wp:cNvGraphicFramePr>
@@ -2100,20 +2067,29 @@
                     <pic:cNvPr id="0" name="magic-release-lesson-form-pc.png"/>
                     <pic:cNvPicPr/>
                   </pic:nvPicPr>
-                  <pic:blipFill>
+                  <pic:blipFill rotWithShape="1">
                     <a:blip r:embed="rId16"/>
+                    <a:srcRect b="4745"/>
                     <a:stretch>
                       <a:fillRect/>
                     </a:stretch>
                   </pic:blipFill>
-                  <pic:spPr>
+                  <pic:spPr bwMode="auto">
                     <a:xfrm>
                       <a:off x="0" y="0"/>
-                      <a:ext cx="5943600" cy="3343275"/>
+                      <a:ext cx="5943600" cy="3184634"/>
                     </a:xfrm>
                     <a:prstGeom prst="rect">
                       <a:avLst/>
                     </a:prstGeom>
+                    <a:ln>
+                      <a:noFill/>
+                    </a:ln>
+                    <a:extLst>
+                      <a:ext uri="{53640926-AAD7-44D8-BBD7-CCE9431645EC}">
+                        <a14:shadowObscured xmlns:a14="http://schemas.microsoft.com/office/drawing/2010/main"/>
+                      </a:ext>
+                    </a:extLst>
                   </pic:spPr>
                 </pic:pic>
               </a:graphicData>
@@ -2359,8 +2335,8 @@
           <w:noProof/>
         </w:rPr>
         <w:drawing>
-          <wp:inline distT="0" distB="0" distL="0" distR="0" wp14:anchorId="002AE211" wp14:editId="082F577B">
-            <wp:extent cx="5943600" cy="3343275"/>
+          <wp:inline distT="0" distB="0" distL="0" distR="0" wp14:anchorId="002AE211" wp14:editId="6AA26093">
+            <wp:extent cx="5943600" cy="3148148"/>
             <wp:effectExtent l="0" t="0" r="0" b="0"/>
             <wp:docPr id="10" name="Настройки расписания на Windows Release с филиалом Сокол, преподавателем Афанасов Максим и переключателями рабочих дней " descr="Настройки расписания на Windows Release с филиалом Сокол, преподавателем Афанасов Максим и переключателями рабочих дней недели."/>
             <wp:cNvGraphicFramePr>
@@ -2373,20 +2349,29 @@
                     <pic:cNvPr id="0" name="magic-release-settings-schedule-pc-retry.png"/>
                     <pic:cNvPicPr/>
                   </pic:nvPicPr>
-                  <pic:blipFill>
+                  <pic:blipFill rotWithShape="1">
                     <a:blip r:embed="rId17"/>
+                    <a:srcRect b="5836"/>
                     <a:stretch>
                       <a:fillRect/>
                     </a:stretch>
                   </pic:blipFill>
-                  <pic:spPr>
+                  <pic:spPr bwMode="auto">
                     <a:xfrm>
                       <a:off x="0" y="0"/>
-                      <a:ext cx="5943600" cy="3343275"/>
+                      <a:ext cx="5943600" cy="3148148"/>
                     </a:xfrm>
                     <a:prstGeom prst="rect">
                       <a:avLst/>
                     </a:prstGeom>
+                    <a:ln>
+                      <a:noFill/>
+                    </a:ln>
+                    <a:extLst>
+                      <a:ext uri="{53640926-AAD7-44D8-BBD7-CCE9431645EC}">
+                        <a14:shadowObscured xmlns:a14="http://schemas.microsoft.com/office/drawing/2010/main"/>
+                      </a:ext>
+                    </a:extLst>
                   </pic:spPr>
                 </pic:pic>
               </a:graphicData>
@@ -2632,8 +2617,8 @@
           <w:noProof/>
         </w:rPr>
         <w:drawing>
-          <wp:inline distT="0" distB="0" distL="0" distR="0" wp14:anchorId="1B3BD118" wp14:editId="60D14B8A">
-            <wp:extent cx="5943600" cy="3343275"/>
+          <wp:inline distT="0" distB="0" distL="0" distR="0" wp14:anchorId="1B3BD118" wp14:editId="64A99274">
+            <wp:extent cx="5943600" cy="3206931"/>
             <wp:effectExtent l="0" t="0" r="0" b="0"/>
             <wp:docPr id="11" name="Дневной календарь Windows Release за 8 августа 2026 с реальными аудиториями и клиентами, шестью занятыми аудиториями и н" descr="Дневной календарь Windows Release за 8 августа 2026 с реальными аудиториями и клиентами, шестью занятыми аудиториями и нулём конфликтов."/>
             <wp:cNvGraphicFramePr>
@@ -2646,20 +2631,29 @@
                     <pic:cNvPr id="0" name="magic-release-schedule-day-pc.png"/>
                     <pic:cNvPicPr/>
                   </pic:nvPicPr>
-                  <pic:blipFill>
+                  <pic:blipFill rotWithShape="1">
                     <a:blip r:embed="rId18"/>
+                    <a:srcRect b="4079"/>
                     <a:stretch>
                       <a:fillRect/>
                     </a:stretch>
                   </pic:blipFill>
-                  <pic:spPr>
+                  <pic:spPr bwMode="auto">
                     <a:xfrm>
                       <a:off x="0" y="0"/>
-                      <a:ext cx="5943600" cy="3343275"/>
+                      <a:ext cx="5943600" cy="3206931"/>
                     </a:xfrm>
                     <a:prstGeom prst="rect">
                       <a:avLst/>
                     </a:prstGeom>
+                    <a:ln>
+                      <a:noFill/>
+                    </a:ln>
+                    <a:extLst>
+                      <a:ext uri="{53640926-AAD7-44D8-BBD7-CCE9431645EC}">
+                        <a14:shadowObscured xmlns:a14="http://schemas.microsoft.com/office/drawing/2010/main"/>
+                      </a:ext>
+                    </a:extLst>
                   </pic:spPr>
                 </pic:pic>
               </a:graphicData>
@@ -3068,9 +3062,9 @@
           <w:noProof/>
         </w:rPr>
         <w:drawing>
-          <wp:inline distT="0" distB="0" distL="0" distR="0" wp14:anchorId="108EFE89" wp14:editId="58C77628">
-            <wp:extent cx="5943600" cy="3343275"/>
-            <wp:effectExtent l="0" t="0" r="0" b="0"/>
+          <wp:inline distT="0" distB="0" distL="0" distR="0" wp14:anchorId="108EFE89" wp14:editId="35F39D0C">
+            <wp:extent cx="5943600" cy="3193869"/>
+            <wp:effectExtent l="0" t="0" r="0" b="6985"/>
             <wp:docPr id="13" name="Месячный календарь Windows Release за август 2026 с реальными клиентами, количеством занятий в каждом дне и выбранным 8 " descr="Месячный календарь Windows Release за август 2026 с реальными клиентами, количеством занятий в каждом дне и выбранным 8 августа."/>
             <wp:cNvGraphicFramePr>
               <a:graphicFrameLocks xmlns:a="http://schemas.openxmlformats.org/drawingml/2006/main" noChangeAspect="1"/>
@@ -3082,20 +3076,29 @@
                     <pic:cNvPr id="0" name="magic-release-schedule-pc-1.png"/>
                     <pic:cNvPicPr/>
                   </pic:nvPicPr>
-                  <pic:blipFill>
+                  <pic:blipFill rotWithShape="1">
                     <a:blip r:embed="rId20"/>
+                    <a:srcRect b="4469"/>
                     <a:stretch>
                       <a:fillRect/>
                     </a:stretch>
                   </pic:blipFill>
-                  <pic:spPr>
+                  <pic:spPr bwMode="auto">
                     <a:xfrm>
                       <a:off x="0" y="0"/>
-                      <a:ext cx="5943600" cy="3343275"/>
+                      <a:ext cx="5943600" cy="3193869"/>
                     </a:xfrm>
                     <a:prstGeom prst="rect">
                       <a:avLst/>
                     </a:prstGeom>
+                    <a:ln>
+                      <a:noFill/>
+                    </a:ln>
+                    <a:extLst>
+                      <a:ext uri="{53640926-AAD7-44D8-BBD7-CCE9431645EC}">
+                        <a14:shadowObscured xmlns:a14="http://schemas.microsoft.com/office/drawing/2010/main"/>
+                      </a:ext>
+                    </a:extLst>
                   </pic:spPr>
                 </pic:pic>
               </a:graphicData>
@@ -3371,9 +3374,9 @@
           <w:noProof/>
         </w:rPr>
         <w:drawing>
-          <wp:inline distT="0" distB="0" distL="0" distR="0" wp14:anchorId="01DA9BE6" wp14:editId="3A9B8964">
-            <wp:extent cx="5943600" cy="3343275"/>
-            <wp:effectExtent l="0" t="0" r="0" b="0"/>
+          <wp:inline distT="0" distB="0" distL="0" distR="0" wp14:anchorId="01DA9BE6" wp14:editId="0051E957">
+            <wp:extent cx="5943600" cy="3213463"/>
+            <wp:effectExtent l="0" t="0" r="0" b="6350"/>
             <wp:docPr id="15" name="Форма новой задачи на Windows Release с названием, приоритетом, описанием, датой, переключателем на весь день и выбором " descr="Форма новой задачи на Windows Release с названием, приоритетом, описанием, датой, переключателем на весь день и выбором получателей."/>
             <wp:cNvGraphicFramePr>
               <a:graphicFrameLocks xmlns:a="http://schemas.openxmlformats.org/drawingml/2006/main" noChangeAspect="1"/>
@@ -3385,20 +3388,29 @@
                     <pic:cNvPr id="0" name="magic-release-task-form-pc.png"/>
                     <pic:cNvPicPr/>
                   </pic:nvPicPr>
-                  <pic:blipFill>
+                  <pic:blipFill rotWithShape="1">
                     <a:blip r:embed="rId22"/>
+                    <a:srcRect b="3883"/>
                     <a:stretch>
                       <a:fillRect/>
                     </a:stretch>
                   </pic:blipFill>
-                  <pic:spPr>
+                  <pic:spPr bwMode="auto">
                     <a:xfrm>
                       <a:off x="0" y="0"/>
-                      <a:ext cx="5943600" cy="3343275"/>
+                      <a:ext cx="5943600" cy="3213463"/>
                     </a:xfrm>
                     <a:prstGeom prst="rect">
                       <a:avLst/>
                     </a:prstGeom>
+                    <a:ln>
+                      <a:noFill/>
+                    </a:ln>
+                    <a:extLst>
+                      <a:ext uri="{53640926-AAD7-44D8-BBD7-CCE9431645EC}">
+                        <a14:shadowObscured xmlns:a14="http://schemas.microsoft.com/office/drawing/2010/main"/>
+                      </a:ext>
+                    </a:extLst>
                   </pic:spPr>
                 </pic:pic>
               </a:graphicData>
@@ -3640,8 +3652,8 @@
           <w:noProof/>
         </w:rPr>
         <w:drawing>
-          <wp:inline distT="0" distB="0" distL="0" distR="0" wp14:anchorId="7BF29C11" wp14:editId="255A27BF">
-            <wp:extent cx="5943600" cy="3343275"/>
+          <wp:inline distT="0" distB="0" distL="0" distR="0" wp14:anchorId="7BF29C11" wp14:editId="557C14EC">
+            <wp:extent cx="5943600" cy="3200400"/>
             <wp:effectExtent l="0" t="0" r="0" b="0"/>
             <wp:docPr id="16" name="Раздел задач Windows Release с 350 просроченными задачами, фильтрами Открытые, Просроченные, Закрытые и кнопками Закрыть" descr="Раздел задач Windows Release с 350 просроченными задачами, фильтрами Открытые, Просроченные, Закрытые и кнопками Закрыть задачу."/>
             <wp:cNvGraphicFramePr>
@@ -3654,20 +3666,29 @@
                     <pic:cNvPr id="0" name="magic-release-tasks-pc.png"/>
                     <pic:cNvPicPr/>
                   </pic:nvPicPr>
-                  <pic:blipFill>
+                  <pic:blipFill rotWithShape="1">
                     <a:blip r:embed="rId23"/>
+                    <a:srcRect b="4273"/>
                     <a:stretch>
                       <a:fillRect/>
                     </a:stretch>
                   </pic:blipFill>
-                  <pic:spPr>
+                  <pic:spPr bwMode="auto">
                     <a:xfrm>
                       <a:off x="0" y="0"/>
-                      <a:ext cx="5943600" cy="3343275"/>
+                      <a:ext cx="5943600" cy="3200400"/>
                     </a:xfrm>
                     <a:prstGeom prst="rect">
                       <a:avLst/>
                     </a:prstGeom>
+                    <a:ln>
+                      <a:noFill/>
+                    </a:ln>
+                    <a:extLst>
+                      <a:ext uri="{53640926-AAD7-44D8-BBD7-CCE9431645EC}">
+                        <a14:shadowObscured xmlns:a14="http://schemas.microsoft.com/office/drawing/2010/main"/>
+                      </a:ext>
+                    </a:extLst>
                   </pic:spPr>
                 </pic:pic>
               </a:graphicData>
@@ -3997,9 +4018,9 @@
           <w:noProof/>
         </w:rPr>
         <w:drawing>
-          <wp:inline distT="0" distB="0" distL="0" distR="0" wp14:anchorId="0EB38FB3" wp14:editId="199C7A2E">
-            <wp:extent cx="5943600" cy="3343275"/>
-            <wp:effectExtent l="0" t="0" r="0" b="0"/>
+          <wp:inline distT="0" distB="0" distL="0" distR="0" wp14:anchorId="0EB38FB3" wp14:editId="0CB3B185">
+            <wp:extent cx="5943600" cy="3174274"/>
+            <wp:effectExtent l="0" t="0" r="0" b="7620"/>
             <wp:docPr id="17" name="Раздел Ученики Windows Release с поиском, фильтрами и реальными колонками Активные 148 и Неактивные 352." descr="Раздел Ученики Windows Release с поиском, фильтрами и реальными колонками Активные 148 и Неактивные 352."/>
             <wp:cNvGraphicFramePr>
               <a:graphicFrameLocks xmlns:a="http://schemas.openxmlformats.org/drawingml/2006/main" noChangeAspect="1"/>
@@ -4011,20 +4032,29 @@
                     <pic:cNvPr id="0" name="magic-students-current.png"/>
                     <pic:cNvPicPr/>
                   </pic:nvPicPr>
-                  <pic:blipFill>
+                  <pic:blipFill rotWithShape="1">
                     <a:blip r:embed="rId24"/>
+                    <a:srcRect b="5055"/>
                     <a:stretch>
                       <a:fillRect/>
                     </a:stretch>
                   </pic:blipFill>
-                  <pic:spPr>
+                  <pic:spPr bwMode="auto">
                     <a:xfrm>
                       <a:off x="0" y="0"/>
-                      <a:ext cx="5943600" cy="3343275"/>
+                      <a:ext cx="5943600" cy="3174274"/>
                     </a:xfrm>
                     <a:prstGeom prst="rect">
                       <a:avLst/>
                     </a:prstGeom>
+                    <a:ln>
+                      <a:noFill/>
+                    </a:ln>
+                    <a:extLst>
+                      <a:ext uri="{53640926-AAD7-44D8-BBD7-CCE9431645EC}">
+                        <a14:shadowObscured xmlns:a14="http://schemas.microsoft.com/office/drawing/2010/main"/>
+                      </a:ext>
+                    </a:extLst>
                   </pic:spPr>
                 </pic:pic>
               </a:graphicData>
@@ -4739,8 +4769,8 @@
           <w:noProof/>
         </w:rPr>
         <w:drawing>
-          <wp:inline distT="0" distB="0" distL="0" distR="0" wp14:anchorId="642A34F1" wp14:editId="423DFA56">
-            <wp:extent cx="5943600" cy="3343275"/>
+          <wp:inline distT="0" distB="0" distL="0" distR="0" wp14:anchorId="642A34F1" wp14:editId="02DC2ED3">
+            <wp:extent cx="5943600" cy="3226526"/>
             <wp:effectExtent l="0" t="0" r="0" b="0"/>
             <wp:docPr id="19" name="Единый dashboard Windows Release с реальными показателями, фильтрами периода и филиала и кнопками XLSX, CSV и Финансы XL" descr="Единый dashboard Windows Release с реальными показателями, фильтрами периода и филиала и кнопками XLSX, CSV и Финансы XLSX."/>
             <wp:cNvGraphicFramePr>
@@ -4753,20 +4783,29 @@
                     <pic:cNvPr id="0" name="magic-release-analytics-pc.png"/>
                     <pic:cNvPicPr/>
                   </pic:nvPicPr>
-                  <pic:blipFill>
+                  <pic:blipFill rotWithShape="1">
                     <a:blip r:embed="rId26"/>
+                    <a:srcRect b="3492"/>
                     <a:stretch>
                       <a:fillRect/>
                     </a:stretch>
                   </pic:blipFill>
-                  <pic:spPr>
+                  <pic:spPr bwMode="auto">
                     <a:xfrm>
                       <a:off x="0" y="0"/>
-                      <a:ext cx="5943600" cy="3343275"/>
+                      <a:ext cx="5943600" cy="3226526"/>
                     </a:xfrm>
                     <a:prstGeom prst="rect">
                       <a:avLst/>
                     </a:prstGeom>
+                    <a:ln>
+                      <a:noFill/>
+                    </a:ln>
+                    <a:extLst>
+                      <a:ext uri="{53640926-AAD7-44D8-BBD7-CCE9431645EC}">
+                        <a14:shadowObscured xmlns:a14="http://schemas.microsoft.com/office/drawing/2010/main"/>
+                      </a:ext>
+                    </a:extLst>
                   </pic:spPr>
                 </pic:pic>
               </a:graphicData>
@@ -4959,7 +4998,13 @@
           <w:lang w:val="ru-RU"/>
         </w:rPr>
         <w:lastRenderedPageBreak/>
-        <w:t>Итоговая проверка кандидата</w:t>
+        <w:t xml:space="preserve">Итоговая проверка </w:t>
+      </w:r>
+      <w:r>
+        <w:rPr>
+          <w:lang w:val="ru-RU"/>
+        </w:rPr>
+        <w:t>релиза</w:t>
       </w:r>
     </w:p>
     <w:p>
@@ -5249,74 +5294,8 @@
         <w:t>-клиента совпадают</w:t>
       </w:r>
     </w:p>
-    <w:p>
-      <w:pPr>
-        <w:pStyle w:val="1"/>
-        <w:rPr>
-          <w:lang w:val="ru-RU"/>
-        </w:rPr>
-      </w:pPr>
-      <w:r>
-        <w:rPr>
-          <w:lang w:val="ru-RU"/>
-        </w:rPr>
-        <w:t>Решение о готовности</w:t>
-      </w:r>
-    </w:p>
-    <w:p>
-      <w:pPr>
-        <w:rPr>
-          <w:lang w:val="ru-RU"/>
-        </w:rPr>
-      </w:pPr>
-      <w:r>
-        <w:rPr>
-          <w:b/>
-          <w:color w:val="186A3B"/>
-          <w:sz w:val="24"/>
-          <w:lang w:val="ru-RU"/>
-        </w:rPr>
-        <w:t>Кандидат 1.5.1+158 готов к пользовательской проверке по 26 пунктам.</w:t>
-      </w:r>
-    </w:p>
-    <w:p>
-      <w:pPr>
-        <w:rPr>
-          <w:lang w:val="ru-RU"/>
-        </w:rPr>
-      </w:pPr>
-      <w:r>
-        <w:rPr>
-          <w:lang w:val="ru-RU"/>
-        </w:rPr>
-        <w:t xml:space="preserve">Документ сознательно не подменяет серверные гарантии декоративными скриншотами и не создаёт вымышленные </w:t>
-      </w:r>
-      <w:r>
-        <w:t>production</w:t>
-      </w:r>
-      <w:r>
-        <w:rPr>
-          <w:lang w:val="ru-RU"/>
-        </w:rPr>
-        <w:t xml:space="preserve">-данные. Все визуальные доказательства относятся к реальной </w:t>
-      </w:r>
-      <w:r>
-        <w:t>release</w:t>
-      </w:r>
-      <w:r>
-        <w:rPr>
-          <w:lang w:val="ru-RU"/>
-        </w:rPr>
-        <w:t>-сборке; все невидимые правила подтверждены автоматическими проверками.</w:t>
-      </w:r>
-    </w:p>
     <w:sectPr>
-      <w:headerReference w:type="even" r:id="rId27"/>
-      <w:headerReference w:type="default" r:id="rId28"/>
-      <w:footerReference w:type="even" r:id="rId29"/>
-      <w:footerReference w:type="default" r:id="rId30"/>
-      <w:headerReference w:type="first" r:id="rId31"/>
-      <w:footerReference w:type="first" r:id="rId32"/>
+      <w:footerReference w:type="default" r:id="rId27"/>
       <w:pgSz w:w="12240" w:h="15840"/>
       <w:pgMar w:top="1440" w:right="1440" w:bottom="1440" w:left="1440" w:header="708" w:footer="708" w:gutter="0"/>
       <w:cols w:space="720"/>
@@ -5356,16 +5335,6 @@
   <w:p>
     <w:pPr>
       <w:pStyle w:val="a7"/>
-    </w:pPr>
-  </w:p>
-</w:ftr>
-</file>
-
-<file path=word/footer2.xml><?xml version="1.0" encoding="utf-8"?>
-<w:ftr xmlns:wpc="http://schemas.microsoft.com/office/word/2010/wordprocessingCanvas" xmlns:cx="http://schemas.microsoft.com/office/drawing/2014/chartex" xmlns:cx1="http://schemas.microsoft.com/office/drawing/2015/9/8/chartex" xmlns:cx2="http://schemas.microsoft.com/office/drawing/2015/10/21/chartex" xmlns:cx3="http://schemas.microsoft.com/office/drawing/2016/5/9/chartex" xmlns:cx4="http://schemas.microsoft.com/office/drawing/2016/5/10/chartex" xmlns:cx5="http://schemas.microsoft.com/office/drawing/2016/5/11/chartex" xmlns:cx6="http://schemas.microsoft.com/office/drawing/2016/5/12/chartex" xmlns:cx7="http://schemas.microsoft.com/office/drawing/2016/5/13/chartex" xmlns:cx8="http://schemas.microsoft.com/office/drawing/2016/5/14/chartex" xmlns:mc="http://schemas.openxmlformats.org/markup-compatibility/2006" xmlns:aink="http://schemas.microsoft.com/office/drawing/2016/ink" xmlns:am3d="http://schemas.microsoft.com/office/drawing/2017/model3d" xmlns:o="urn:schemas-microsoft-com:office:office" xmlns:oel="http://schemas.microsoft.com/office/2019/extlst" xmlns:r="http://schemas.openxmlformats.org/officeDocument/2006/relationships" xmlns:m="http://schemas.openxmlformats.org/officeDocument/2006/math" xmlns:v="urn:schemas-microsoft-com:vml" xmlns:wp14="http://schemas.microsoft.com/office/word/2010/wordprocessingDrawing" xmlns:wp="http://schemas.openxmlformats.org/drawingml/2006/wordprocessingDrawing" xmlns:w10="urn:schemas-microsoft-com:office:word" xmlns:w="http://schemas.openxmlformats.org/wordprocessingml/2006/main" xmlns:w14="http://schemas.microsoft.com/office/word/2010/wordml" xmlns:w15="http://schemas.microsoft.com/office/word/2012/wordml" xmlns:w16cei="http://schemas.microsoft.com/office/word/2026/wordml/cei" xmlns:w16cex="http://schemas.microsoft.com/office/word/2018/wordml/cex" xmlns:w16cid="http://schemas.microsoft.com/office/word/2016/wordml/cid" xmlns:w16="http://schemas.microsoft.com/office/word/2018/wordml" xmlns:w16du="http://schemas.microsoft.com/office/word/2023/wordml/word16du" xmlns:w16sdtdh="http://schemas.microsoft.com/office/word/2020/wordml/sdtdatahash" xmlns:w16sdtfl="http://schemas.microsoft.com/office/word/2024/wordml/sdtformatlock" xmlns:w16se="http://schemas.microsoft.com/office/word/2015/wordml/symex" xmlns:wpg="http://schemas.microsoft.com/office/word/2010/wordprocessingGroup" xmlns:wpi="http://schemas.microsoft.com/office/word/2010/wordprocessingInk" xmlns:wne="http://schemas.microsoft.com/office/word/2006/wordml" xmlns:wps="http://schemas.microsoft.com/office/word/2010/wordprocessingShape" mc:Ignorable="w14 w15 w16se w16cid w16 w16cex w16sdtdh w16sdtfl w16du wp14">
-  <w:p>
-    <w:pPr>
-      <w:pStyle w:val="a7"/>
       <w:jc w:val="center"/>
       <w:rPr>
         <w:color w:val="auto"/>
@@ -5472,16 +5441,6 @@
       </w:rPr>
       <w:fldChar w:fldCharType="end"/>
     </w:r>
-  </w:p>
-</w:ftr>
-</file>
-
-<file path=word/footer3.xml><?xml version="1.0" encoding="utf-8"?>
-<w:ftr xmlns:wpc="http://schemas.microsoft.com/office/word/2010/wordprocessingCanvas" xmlns:cx="http://schemas.microsoft.com/office/drawing/2014/chartex" xmlns:cx1="http://schemas.microsoft.com/office/drawing/2015/9/8/chartex" xmlns:cx2="http://schemas.microsoft.com/office/drawing/2015/10/21/chartex" xmlns:cx3="http://schemas.microsoft.com/office/drawing/2016/5/9/chartex" xmlns:cx4="http://schemas.microsoft.com/office/drawing/2016/5/10/chartex" xmlns:cx5="http://schemas.microsoft.com/office/drawing/2016/5/11/chartex" xmlns:cx6="http://schemas.microsoft.com/office/drawing/2016/5/12/chartex" xmlns:cx7="http://schemas.microsoft.com/office/drawing/2016/5/13/chartex" xmlns:cx8="http://schemas.microsoft.com/office/drawing/2016/5/14/chartex" xmlns:mc="http://schemas.openxmlformats.org/markup-compatibility/2006" xmlns:aink="http://schemas.microsoft.com/office/drawing/2016/ink" xmlns:am3d="http://schemas.microsoft.com/office/drawing/2017/model3d" xmlns:o="urn:schemas-microsoft-com:office:office" xmlns:oel="http://schemas.microsoft.com/office/2019/extlst" xmlns:r="http://schemas.openxmlformats.org/officeDocument/2006/relationships" xmlns:m="http://schemas.openxmlformats.org/officeDocument/2006/math" xmlns:v="urn:schemas-microsoft-com:vml" xmlns:wp14="http://schemas.microsoft.com/office/word/2010/wordprocessingDrawing" xmlns:wp="http://schemas.openxmlformats.org/drawingml/2006/wordprocessingDrawing" xmlns:w10="urn:schemas-microsoft-com:office:word" xmlns:w="http://schemas.openxmlformats.org/wordprocessingml/2006/main" xmlns:w14="http://schemas.microsoft.com/office/word/2010/wordml" xmlns:w15="http://schemas.microsoft.com/office/word/2012/wordml" xmlns:w16cei="http://schemas.microsoft.com/office/word/2026/wordml/cei" xmlns:w16cex="http://schemas.microsoft.com/office/word/2018/wordml/cex" xmlns:w16cid="http://schemas.microsoft.com/office/word/2016/wordml/cid" xmlns:w16="http://schemas.microsoft.com/office/word/2018/wordml" xmlns:w16du="http://schemas.microsoft.com/office/word/2023/wordml/word16du" xmlns:w16sdtdh="http://schemas.microsoft.com/office/word/2020/wordml/sdtdatahash" xmlns:w16sdtfl="http://schemas.microsoft.com/office/word/2024/wordml/sdtformatlock" xmlns:w16se="http://schemas.microsoft.com/office/word/2015/wordml/symex" xmlns:wpg="http://schemas.microsoft.com/office/word/2010/wordprocessingGroup" xmlns:wpi="http://schemas.microsoft.com/office/word/2010/wordprocessingInk" xmlns:wne="http://schemas.microsoft.com/office/word/2006/wordml" xmlns:wps="http://schemas.microsoft.com/office/word/2010/wordprocessingShape" mc:Ignorable="w14 w15 w16se w16cid w16 w16cex w16sdtdh w16sdtfl w16du wp14">
-  <w:p>
-    <w:pPr>
-      <w:pStyle w:val="a7"/>
-    </w:pPr>
   </w:p>
 </w:ftr>
 </file>
@@ -5509,76 +5468,6 @@
     </w:p>
   </w:footnote>
 </w:footnotes>
-</file>
-
-<file path=word/header1.xml><?xml version="1.0" encoding="utf-8"?>
-<w:hdr xmlns:wpc="http://schemas.microsoft.com/office/word/2010/wordprocessingCanvas" xmlns:cx="http://schemas.microsoft.com/office/drawing/2014/chartex" xmlns:cx1="http://schemas.microsoft.com/office/drawing/2015/9/8/chartex" xmlns:cx2="http://schemas.microsoft.com/office/drawing/2015/10/21/chartex" xmlns:cx3="http://schemas.microsoft.com/office/drawing/2016/5/9/chartex" xmlns:cx4="http://schemas.microsoft.com/office/drawing/2016/5/10/chartex" xmlns:cx5="http://schemas.microsoft.com/office/drawing/2016/5/11/chartex" xmlns:cx6="http://schemas.microsoft.com/office/drawing/2016/5/12/chartex" xmlns:cx7="http://schemas.microsoft.com/office/drawing/2016/5/13/chartex" xmlns:cx8="http://schemas.microsoft.com/office/drawing/2016/5/14/chartex" xmlns:mc="http://schemas.openxmlformats.org/markup-compatibility/2006" xmlns:aink="http://schemas.microsoft.com/office/drawing/2016/ink" xmlns:am3d="http://schemas.microsoft.com/office/drawing/2017/model3d" xmlns:o="urn:schemas-microsoft-com:office:office" xmlns:oel="http://schemas.microsoft.com/office/2019/extlst" xmlns:r="http://schemas.openxmlformats.org/officeDocument/2006/relationships" xmlns:m="http://schemas.openxmlformats.org/officeDocument/2006/math" xmlns:v="urn:schemas-microsoft-com:vml" xmlns:wp14="http://schemas.microsoft.com/office/word/2010/wordprocessingDrawing" xmlns:wp="http://schemas.openxmlformats.org/drawingml/2006/wordprocessingDrawing" xmlns:w10="urn:schemas-microsoft-com:office:word" xmlns:w="http://schemas.openxmlformats.org/wordprocessingml/2006/main" xmlns:w14="http://schemas.microsoft.com/office/word/2010/wordml" xmlns:w15="http://schemas.microsoft.com/office/word/2012/wordml" xmlns:w16cei="http://schemas.microsoft.com/office/word/2026/wordml/cei" xmlns:w16cex="http://schemas.microsoft.com/office/word/2018/wordml/cex" xmlns:w16cid="http://schemas.microsoft.com/office/word/2016/wordml/cid" xmlns:w16="http://schemas.microsoft.com/office/word/2018/wordml" xmlns:w16du="http://schemas.microsoft.com/office/word/2023/wordml/word16du" xmlns:w16sdtdh="http://schemas.microsoft.com/office/word/2020/wordml/sdtdatahash" xmlns:w16sdtfl="http://schemas.microsoft.com/office/word/2024/wordml/sdtformatlock" xmlns:w16se="http://schemas.microsoft.com/office/word/2015/wordml/symex" xmlns:wpg="http://schemas.microsoft.com/office/word/2010/wordprocessingGroup" xmlns:wpi="http://schemas.microsoft.com/office/word/2010/wordprocessingInk" xmlns:wne="http://schemas.microsoft.com/office/word/2006/wordml" xmlns:wps="http://schemas.microsoft.com/office/word/2010/wordprocessingShape" mc:Ignorable="w14 w15 w16se w16cid w16 w16cex w16sdtdh w16sdtfl w16du wp14">
-  <w:p>
-    <w:pPr>
-      <w:pStyle w:val="a5"/>
-    </w:pPr>
-  </w:p>
-</w:hdr>
-</file>
-
-<file path=word/header2.xml><?xml version="1.0" encoding="utf-8"?>
-<w:hdr xmlns:wpc="http://schemas.microsoft.com/office/word/2010/wordprocessingCanvas" xmlns:cx="http://schemas.microsoft.com/office/drawing/2014/chartex" xmlns:cx1="http://schemas.microsoft.com/office/drawing/2015/9/8/chartex" xmlns:cx2="http://schemas.microsoft.com/office/drawing/2015/10/21/chartex" xmlns:cx3="http://schemas.microsoft.com/office/drawing/2016/5/9/chartex" xmlns:cx4="http://schemas.microsoft.com/office/drawing/2016/5/10/chartex" xmlns:cx5="http://schemas.microsoft.com/office/drawing/2016/5/11/chartex" xmlns:cx6="http://schemas.microsoft.com/office/drawing/2016/5/12/chartex" xmlns:cx7="http://schemas.microsoft.com/office/drawing/2016/5/13/chartex" xmlns:cx8="http://schemas.microsoft.com/office/drawing/2016/5/14/chartex" xmlns:mc="http://schemas.openxmlformats.org/markup-compatibility/2006" xmlns:aink="http://schemas.microsoft.com/office/drawing/2016/ink" xmlns:am3d="http://schemas.microsoft.com/office/drawing/2017/model3d" xmlns:o="urn:schemas-microsoft-com:office:office" xmlns:oel="http://schemas.microsoft.com/office/2019/extlst" xmlns:r="http://schemas.openxmlformats.org/officeDocument/2006/relationships" xmlns:m="http://schemas.openxmlformats.org/officeDocument/2006/math" xmlns:v="urn:schemas-microsoft-com:vml" xmlns:wp14="http://schemas.microsoft.com/office/word/2010/wordprocessingDrawing" xmlns:wp="http://schemas.openxmlformats.org/drawingml/2006/wordprocessingDrawing" xmlns:w10="urn:schemas-microsoft-com:office:word" xmlns:w="http://schemas.openxmlformats.org/wordprocessingml/2006/main" xmlns:w14="http://schemas.microsoft.com/office/word/2010/wordml" xmlns:w15="http://schemas.microsoft.com/office/word/2012/wordml" xmlns:w16cei="http://schemas.microsoft.com/office/word/2026/wordml/cei" xmlns:w16cex="http://schemas.microsoft.com/office/word/2018/wordml/cex" xmlns:w16cid="http://schemas.microsoft.com/office/word/2016/wordml/cid" xmlns:w16="http://schemas.microsoft.com/office/word/2018/wordml" xmlns:w16du="http://schemas.microsoft.com/office/word/2023/wordml/word16du" xmlns:w16sdtdh="http://schemas.microsoft.com/office/word/2020/wordml/sdtdatahash" xmlns:w16sdtfl="http://schemas.microsoft.com/office/word/2024/wordml/sdtformatlock" xmlns:w16se="http://schemas.microsoft.com/office/word/2015/wordml/symex" xmlns:wpg="http://schemas.microsoft.com/office/word/2010/wordprocessingGroup" xmlns:wpi="http://schemas.microsoft.com/office/word/2010/wordprocessingInk" xmlns:wne="http://schemas.microsoft.com/office/word/2006/wordml" xmlns:wps="http://schemas.microsoft.com/office/word/2010/wordprocessingShape" mc:Ignorable="w14 w15 w16se w16cid w16 w16cex w16sdtdh w16sdtfl w16du wp14">
-  <w:p>
-    <w:pPr>
-      <w:pStyle w:val="a5"/>
-    </w:pPr>
-    <w:proofErr w:type="spellStart"/>
-    <w:r>
-      <w:rPr>
-        <w:color w:val="5F6B78"/>
-        <w:sz w:val="18"/>
-      </w:rPr>
-      <w:t>MagicMusicCRM</w:t>
-    </w:r>
-    <w:proofErr w:type="spellEnd"/>
-    <w:r>
-      <w:rPr>
-        <w:color w:val="5F6B78"/>
-        <w:sz w:val="18"/>
-      </w:rPr>
-      <w:t xml:space="preserve"> · 1.5.1+158</w:t>
-    </w:r>
-    <w:r>
-      <w:rPr>
-        <w:color w:val="5F6B78"/>
-        <w:sz w:val="18"/>
-      </w:rPr>
-      <w:tab/>
-      <w:t xml:space="preserve">26 </w:t>
-    </w:r>
-    <w:proofErr w:type="spellStart"/>
-    <w:r>
-      <w:rPr>
-        <w:color w:val="5F6B78"/>
-        <w:sz w:val="18"/>
-      </w:rPr>
-      <w:t>пунктов</w:t>
-    </w:r>
-    <w:proofErr w:type="spellEnd"/>
-    <w:r>
-      <w:rPr>
-        <w:color w:val="5F6B78"/>
-        <w:sz w:val="18"/>
-      </w:rPr>
-      <w:t xml:space="preserve"> ТЗ</w:t>
-    </w:r>
-  </w:p>
-</w:hdr>
-</file>
-
-<file path=word/header3.xml><?xml version="1.0" encoding="utf-8"?>
-<w:hdr xmlns:wpc="http://schemas.microsoft.com/office/word/2010/wordprocessingCanvas" xmlns:cx="http://schemas.microsoft.com/office/drawing/2014/chartex" xmlns:cx1="http://schemas.microsoft.com/office/drawing/2015/9/8/chartex" xmlns:cx2="http://schemas.microsoft.com/office/drawing/2015/10/21/chartex" xmlns:cx3="http://schemas.microsoft.com/office/drawing/2016/5/9/chartex" xmlns:cx4="http://schemas.microsoft.com/office/drawing/2016/5/10/chartex" xmlns:cx5="http://schemas.microsoft.com/office/drawing/2016/5/11/chartex" xmlns:cx6="http://schemas.microsoft.com/office/drawing/2016/5/12/chartex" xmlns:cx7="http://schemas.microsoft.com/office/drawing/2016/5/13/chartex" xmlns:cx8="http://schemas.microsoft.com/office/drawing/2016/5/14/chartex" xmlns:mc="http://schemas.openxmlformats.org/markup-compatibility/2006" xmlns:aink="http://schemas.microsoft.com/office/drawing/2016/ink" xmlns:am3d="http://schemas.microsoft.com/office/drawing/2017/model3d" xmlns:o="urn:schemas-microsoft-com:office:office" xmlns:oel="http://schemas.microsoft.com/office/2019/extlst" xmlns:r="http://schemas.openxmlformats.org/officeDocument/2006/relationships" xmlns:m="http://schemas.openxmlformats.org/officeDocument/2006/math" xmlns:v="urn:schemas-microsoft-com:vml" xmlns:wp14="http://schemas.microsoft.com/office/word/2010/wordprocessingDrawing" xmlns:wp="http://schemas.openxmlformats.org/drawingml/2006/wordprocessingDrawing" xmlns:w10="urn:schemas-microsoft-com:office:word" xmlns:w="http://schemas.openxmlformats.org/wordprocessingml/2006/main" xmlns:w14="http://schemas.microsoft.com/office/word/2010/wordml" xmlns:w15="http://schemas.microsoft.com/office/word/2012/wordml" xmlns:w16cei="http://schemas.microsoft.com/office/word/2026/wordml/cei" xmlns:w16cex="http://schemas.microsoft.com/office/word/2018/wordml/cex" xmlns:w16cid="http://schemas.microsoft.com/office/word/2016/wordml/cid" xmlns:w16="http://schemas.microsoft.com/office/word/2018/wordml" xmlns:w16du="http://schemas.microsoft.com/office/word/2023/wordml/word16du" xmlns:w16sdtdh="http://schemas.microsoft.com/office/word/2020/wordml/sdtdatahash" xmlns:w16sdtfl="http://schemas.microsoft.com/office/word/2024/wordml/sdtformatlock" xmlns:w16se="http://schemas.microsoft.com/office/word/2015/wordml/symex" xmlns:wpg="http://schemas.microsoft.com/office/word/2010/wordprocessingGroup" xmlns:wpi="http://schemas.microsoft.com/office/word/2010/wordprocessingInk" xmlns:wne="http://schemas.microsoft.com/office/word/2006/wordml" xmlns:wps="http://schemas.microsoft.com/office/word/2010/wordprocessingShape" mc:Ignorable="w14 w15 w16se w16cid w16 w16cex w16sdtdh w16sdtfl w16du wp14">
-  <w:p>
-    <w:pPr>
-      <w:pStyle w:val="a5"/>
-    </w:pPr>
-  </w:p>
-</w:hdr>
 </file>
 
 <file path=word/numbering.xml><?xml version="1.0" encoding="utf-8"?>

</xml_diff>